<commit_message>
Fix orthography in Day 5 guide and both protocols
Corrected systematic missing accents (tildes), eñes, and diereses
across all three documents: Protocolo 1, Protocolo 2, and Día 5 guide.

Co-Authored-By: Claude Opus 4.6 <noreply@anthropic.com>
Claude-Session: https://claude.ai/code/session_01Ckn4tWPBBtcwfWfjCFoEeh
</commit_message>
<xml_diff>
--- a/D5_Que_merece_continuar.docx
+++ b/D5_Que_merece_continuar.docx
@@ -12,7 +12,7 @@
           <w:color w:val="2C3E50"/>
           <w:sz w:val="52"/>
         </w:rPr>
-        <w:t>Que merece continuar</w:t>
+        <w:t>Qué merece continuar</w:t>
       </w:r>
     </w:p>
     <w:p>
@@ -25,7 +25,7 @@
           <w:color w:val="787878"/>
           <w:sz w:val="24"/>
         </w:rPr>
-        <w:t>Baja Revoluciones  |  Dia 5 del reto</w:t>
+        <w:t>Baja Revoluciones  |  Día 5 del reto</w:t>
       </w:r>
     </w:p>
     <w:p/>

</xml_diff>